<commit_message>
beleidsset: drie correcties na verificatie van samenvattingen en invoeractiviteiten
- bedrijfsmiddelen: bruikleenovereenkomst hoort bij hoofdstuk 5, de inname bij 6; nu twee activiteiten
- incidenten: categorieën en ernstniveaus staan in hoofdstuk 4, niet in 3; nu twee activiteiten
- leveranciers-inkoop: samenvatting noemt ook hoofdstuk 9, eisen per soort dienst
</commit_message>
<xml_diff>
--- a/governance/beleidsset-informatiebeveiliging/invoeren.docx
+++ b/governance/beleidsset-informatiebeveiliging/invoeren.docx
@@ -2043,7 +2043,21 @@
         <w:tab/>
       </w:r>
       <w:r>
-        <w:t xml:space="preserve">Richt een uitgifte- en innameprocedure in met bruikleenovereenkomst en registratie per bedrijfsmiddel (hoofdstuk 6).</w:t>
+        <w:t xml:space="preserve">Laat wie apparatuur in bruikleen krijgt een bruikleenovereenkomst met de gedragsregels tekenen (hoofdstuk 5).</w:t>
+      </w:r>
+    </w:p>
+    <w:p>
+      <w:pPr>
+        <w:pStyle w:val="Lijst"/>
+      </w:pPr>
+      <w:r>
+        <w:t xml:space="preserve">•</w:t>
+      </w:r>
+      <w:r>
+        <w:tab/>
+      </w:r>
+      <w:r>
+        <w:t xml:space="preserve">Richt een innameprocedure in met registratie per bedrijfsmiddel bij vertrek (hoofdstuk 6).</w:t>
       </w:r>
     </w:p>
     <w:p>
@@ -5386,7 +5400,21 @@
         <w:tab/>
       </w:r>
       <w:r>
-        <w:t xml:space="preserve">Stel een incidentprocedure op met rollen, vervangers, termijnen, categorieën en ernstniveaus (hoofdstuk 3).</w:t>
+        <w:t xml:space="preserve">Stel een incidentprocedure op met rollen, vervangers en termijnen (hoofdstuk 3).</w:t>
+      </w:r>
+    </w:p>
+    <w:p>
+      <w:pPr>
+        <w:pStyle w:val="Lijst"/>
+      </w:pPr>
+      <w:r>
+        <w:t xml:space="preserve">•</w:t>
+      </w:r>
+      <w:r>
+        <w:tab/>
+      </w:r>
+      <w:r>
+        <w:t xml:space="preserve">Leg in de incidentprocedure de categorieën en ernstniveaus vast, met per niveau wie wordt geïnformeerd (hoofdstuk 4).</w:t>
       </w:r>
     </w:p>
     <w:p>

</xml_diff>